<commit_message>
docs: 기획서 표지 최종 수정일 2026-10-09 (§439 · doc_fsck ⑥)
★ 날짜가 넘어가서 Zn 포장이 거절됐다. 그 축이 적는 말이 정확하다 — 「고쳤는데
  최종 수정일이 그대로인가」. 고친 날과 표지가 갈리면 받는 사람이 **낡은 판을
  최신으로 읽는다.**

★ 이 자리는 **구조적으로 약하다.** 그 축 자신이 적는다 — 「스쿼시가 파일의 커밋
  날짜를 머지일로 바꾸므로 지금 초록이어도 머지 뒤 ⑥ 이 운다」. 그리고 자정을
  넘기면 어제 찍은 날짜가 거짓이 된다. **`docs/proposal.docx` 가 은퇴하면 이 축도
  같이 사라진다**(`PLAN #142`) — 오늘 그 행을 실측했더니 참조가 **49 파일**이라
  한 판에 못 뺀다. 그 판을 따로 받는다.
</commit_message>
<xml_diff>
--- a/docs/proposal.docx
+++ b/docs/proposal.docx
@@ -87,7 +87,7 @@
           <w:sz w:val="22"/>
           <w:szCs w:val="22"/>
         </w:rPr>
-        <w:t>작성 2026. 08. 14.  ·  최종 수정 2026. 10. 08.</w:t>
+        <w:t>작성 2026. 08. 14.  ·  최종 수정 2026. 10. 09.</w:t>
       </w:r>
     </w:p>
     <w:p>
@@ -334,7 +334,7 @@
           <w:sz w:val="18"/>
           <w:szCs w:val="18"/>
         </w:rPr>
-        <w:t>※ 수치 표기 원칙: 본 문서의 모든 수치는 2026-10-08 기준으로 원본 데이터에서 코드로 재산출한 값이며, 파이프라인 한 명령(src/firelane/pipeline.py)으로 재현된다. 행정구역경계는 2026-08-11 에 확보하여 잠정치를 전부 교체했다. 판정 결과는 산출단위 1,281구간(동명동 · 접근 회랑 · 119안전센터 반경 300m) · 통행 가능 464 · 판정 보류 225 · 통행 불가 192(하한 · MASTER §2) · 영상판정 불가 400 이며, 폭 산출 불가 구간은 0 이다. 폭 값은 아직 현장 실측 전이므로 width_verified 는 false 이고, 실측 후 값이 바뀌되 산출 구조와 필드는 바뀌지 않는다. 잔여 잠정치는 '(잠정)'으로 별도 표기하며, 확정 시 교체한다.</w:t>
+        <w:t>※ 수치 표기 원칙: 본 문서의 모든 수치는 2026-10-09 기준으로 원본 데이터에서 코드로 재산출한 값이며, 파이프라인 한 명령(src/firelane/pipeline.py)으로 재현된다. 행정구역경계는 2026-08-11 에 확보하여 잠정치를 전부 교체했다. 판정 결과는 산출단위 1,281구간(동명동 · 접근 회랑 · 119안전센터 반경 300m) · 통행 가능 464 · 판정 보류 225 · 통행 불가 192(하한 · MASTER §2) · 영상판정 불가 400 이며, 폭 산출 불가 구간은 0 이다. 폭 값은 아직 현장 실측 전이므로 width_verified 는 false 이고, 실측 후 값이 바뀌되 산출 구조와 필드는 바뀌지 않는다. 잔여 잠정치는 '(잠정)'으로 별도 표기하며, 확정 시 교체한다.</w:t>
       </w:r>
     </w:p>
     <w:p>

</xml_diff>

<commit_message>
seal: 측정 배치 재생성 · 봉인 20261009-ledger-disputes20261009-ledger-disputes
</commit_message>
<xml_diff>
--- a/docs/proposal.docx
+++ b/docs/proposal.docx
@@ -30729,7 +30729,7 @@
       <w:r>
         <w:drawing>
           <wp:inline distT="0" distB="0" distL="0" distR="0">
-            <wp:extent cx="5715000" cy="3111500"/>
+            <wp:extent cx="5715000" cy="3230562"/>
             <wp:effectExtent t="0" r="0" b="0" l="0"/>
             <wp:docPr id="1" name="" descr="" title=""/>
             <wp:cNvGraphicFramePr>
@@ -30745,7 +30745,7 @@
                     </pic:cNvPicPr>
                   </pic:nvPicPr>
                   <pic:blipFill>
-                    <a:blip r:embed="rId29" cstate="none"/>
+                    <a:blip r:embed="rId15" cstate="none"/>
                     <a:srcRect/>
                     <a:stretch>
                       <a:fillRect/>
@@ -30754,7 +30754,7 @@
                   <pic:spPr bwMode="auto">
                     <a:xfrm>
                       <a:off x="0" y="0"/>
-                      <a:ext cx="5715000" cy="3111500"/>
+                      <a:ext cx="5715000" cy="3230562"/>
                     </a:xfrm>
                     <a:prstGeom prst="rect">
                       <a:avLst/>

</xml_diff>